<commit_message>
se mejoraron los excel de desglose de alicuota
</commit_message>
<xml_diff>
--- a/app/infraestructura/templates/Plantilla Estudio Condominio.docx
+++ b/app/infraestructura/templates/Plantilla Estudio Condominio.docx
@@ -1679,7 +1679,29 @@
           <w:u w:val="single"/>
           <w:lang w:val="es-ES_tradnl" w:eastAsia="es-ES_tradnl"/>
         </w:rPr>
-        <w:t>condominio_vertical</w:t>
+        <w:t>condominio</w:t>
+      </w:r>
+      <w:r>
+        <w:rPr>
+          <w:rFonts w:cs="Arial"/>
+          <w:bCs/>
+          <w:color w:val="000000" w:themeColor="text1"/>
+          <w:szCs w:val="24"/>
+          <w:u w:val="single"/>
+          <w:lang w:val="es-ES_tradnl" w:eastAsia="es-ES_tradnl"/>
+        </w:rPr>
+        <w:t>_</w:t>
+      </w:r>
+      <w:r>
+        <w:rPr>
+          <w:rFonts w:cs="Arial"/>
+          <w:bCs/>
+          <w:color w:val="000000" w:themeColor="text1"/>
+          <w:szCs w:val="24"/>
+          <w:u w:val="single"/>
+          <w:lang w:val="es-ES_tradnl" w:eastAsia="es-ES_tradnl"/>
+        </w:rPr>
+        <w:t>vertical</w:t>
       </w:r>
       <w:proofErr w:type="spellEnd"/>
       <w:r>
@@ -2374,6 +2396,105 @@
     </w:p>
     <w:p>
       <w:pPr>
+        <w:spacing w:before="100" w:beforeAutospacing="1" w:after="100" w:afterAutospacing="1" w:line="240" w:lineRule="auto"/>
+        <w:jc w:val="both"/>
+        <w:rPr>
+          <w:rFonts w:cs="Arial"/>
+          <w:color w:val="000000" w:themeColor="text1"/>
+          <w:szCs w:val="24"/>
+          <w:u w:val="single"/>
+          <w:lang w:val="es-ES_tradnl" w:eastAsia="es-ES_tradnl"/>
+        </w:rPr>
+      </w:pPr>
+      <w:r>
+        <w:rPr>
+          <w:rFonts w:cs="Arial"/>
+          <w:color w:val="000000" w:themeColor="text1"/>
+          <w:szCs w:val="24"/>
+          <w:u w:val="single"/>
+          <w:lang w:val="es-ES_tradnl" w:eastAsia="es-ES_tradnl"/>
+        </w:rPr>
+        <w:t xml:space="preserve">{%p </w:t>
+      </w:r>
+      <w:proofErr w:type="spellStart"/>
+      <w:r>
+        <w:rPr>
+          <w:rFonts w:cs="Arial"/>
+          <w:color w:val="000000" w:themeColor="text1"/>
+          <w:szCs w:val="24"/>
+          <w:u w:val="single"/>
+          <w:lang w:val="es-ES_tradnl" w:eastAsia="es-ES_tradnl"/>
+        </w:rPr>
+        <w:t>if</w:t>
+      </w:r>
+      <w:proofErr w:type="spellEnd"/>
+      <w:r>
+        <w:rPr>
+          <w:rFonts w:cs="Arial"/>
+          <w:color w:val="000000" w:themeColor="text1"/>
+          <w:szCs w:val="24"/>
+          <w:u w:val="single"/>
+          <w:lang w:val="es-ES_tradnl" w:eastAsia="es-ES_tradnl"/>
+        </w:rPr>
+        <w:t xml:space="preserve"> </w:t>
+      </w:r>
+      <w:proofErr w:type="spellStart"/>
+      <w:r>
+        <w:rPr>
+          <w:rFonts w:cs="Arial"/>
+          <w:color w:val="000000" w:themeColor="text1"/>
+          <w:szCs w:val="24"/>
+          <w:u w:val="single"/>
+          <w:lang w:val="es-ES_tradnl" w:eastAsia="es-ES_tradnl"/>
+        </w:rPr>
+        <w:t>tipo_estudio</w:t>
+      </w:r>
+      <w:proofErr w:type="spellEnd"/>
+      <w:r>
+        <w:rPr>
+          <w:rFonts w:cs="Arial"/>
+          <w:color w:val="000000" w:themeColor="text1"/>
+          <w:szCs w:val="24"/>
+          <w:u w:val="single"/>
+          <w:lang w:val="es-ES_tradnl" w:eastAsia="es-ES_tradnl"/>
+        </w:rPr>
+        <w:t xml:space="preserve"> == “</w:t>
+      </w:r>
+      <w:proofErr w:type="spellStart"/>
+      <w:r>
+        <w:rPr>
+          <w:rFonts w:cs="Arial"/>
+          <w:color w:val="000000" w:themeColor="text1"/>
+          <w:szCs w:val="24"/>
+          <w:u w:val="single"/>
+          <w:lang w:val="es-ES_tradnl" w:eastAsia="es-ES_tradnl"/>
+        </w:rPr>
+        <w:t>espacios_comunes</w:t>
+      </w:r>
+      <w:proofErr w:type="spellEnd"/>
+      <w:r>
+        <w:rPr>
+          <w:rFonts w:cs="Arial"/>
+          <w:color w:val="000000" w:themeColor="text1"/>
+          <w:szCs w:val="24"/>
+          <w:u w:val="single"/>
+          <w:lang w:val="es-ES_tradnl" w:eastAsia="es-ES_tradnl"/>
+        </w:rPr>
+        <w:t>”</w:t>
+      </w:r>
+      <w:r>
+        <w:rPr>
+          <w:rFonts w:cs="Arial"/>
+          <w:color w:val="000000" w:themeColor="text1"/>
+          <w:szCs w:val="24"/>
+          <w:u w:val="single"/>
+          <w:lang w:val="es-ES_tradnl" w:eastAsia="es-ES_tradnl"/>
+        </w:rPr>
+        <w:t xml:space="preserve"> %}</w:t>
+      </w:r>
+    </w:p>
+    <w:p>
+      <w:pPr>
         <w:pStyle w:val="Prrafodelista"/>
         <w:spacing w:before="100" w:beforeAutospacing="1" w:after="100" w:afterAutospacing="1" w:line="240" w:lineRule="auto"/>
         <w:jc w:val="center"/>
@@ -2526,6 +2647,7 @@
           <w:bCs/>
           <w:szCs w:val="24"/>
         </w:rPr>
+        <w:lastRenderedPageBreak/>
         <w:t>monto_asegurado_sugerido</w:t>
       </w:r>
       <w:proofErr w:type="spellEnd"/>
@@ -2579,7 +2701,6 @@
           <w:szCs w:val="24"/>
           <w:lang w:val="es-ES_tradnl" w:eastAsia="es-ES_tradnl"/>
         </w:rPr>
-        <w:lastRenderedPageBreak/>
         <w:t>(Valor to</w:t>
       </w:r>
       <w:r>
@@ -2597,7 +2718,7 @@
           <w:rFonts w:cs="Arial"/>
           <w:szCs w:val="24"/>
         </w:rPr>
-        <w:t>65%</w:t>
+        <w:t>%</w:t>
       </w:r>
       <w:r>
         <w:rPr>
@@ -2608,6 +2729,589 @@
           <w:lang w:val="es-ES_tradnl" w:eastAsia="es-ES_tradnl"/>
         </w:rPr>
         <w:t xml:space="preserve"> Espacio Común) = Valor de Reconstrucción del Espacio Común.</w:t>
+      </w:r>
+    </w:p>
+    <w:p>
+      <w:pPr>
+        <w:spacing w:before="100" w:beforeAutospacing="1" w:after="100" w:afterAutospacing="1" w:line="240" w:lineRule="auto"/>
+        <w:jc w:val="both"/>
+        <w:rPr>
+          <w:rFonts w:cs="Arial"/>
+          <w:color w:val="000000" w:themeColor="text1"/>
+          <w:szCs w:val="24"/>
+          <w:lang w:val="es-ES_tradnl" w:eastAsia="es-ES_tradnl"/>
+        </w:rPr>
+      </w:pPr>
+      <w:r>
+        <w:rPr>
+          <w:rFonts w:cs="Arial"/>
+          <w:color w:val="000000" w:themeColor="text1"/>
+          <w:szCs w:val="24"/>
+          <w:lang w:val="es-ES_tradnl" w:eastAsia="es-ES_tradnl"/>
+        </w:rPr>
+        <w:t xml:space="preserve">{%p </w:t>
+      </w:r>
+      <w:proofErr w:type="spellStart"/>
+      <w:r>
+        <w:rPr>
+          <w:rFonts w:cs="Arial"/>
+          <w:color w:val="000000" w:themeColor="text1"/>
+          <w:szCs w:val="24"/>
+          <w:lang w:val="es-ES_tradnl" w:eastAsia="es-ES_tradnl"/>
+        </w:rPr>
+        <w:t>endif</w:t>
+      </w:r>
+      <w:proofErr w:type="spellEnd"/>
+      <w:r>
+        <w:rPr>
+          <w:rFonts w:cs="Arial"/>
+          <w:color w:val="000000" w:themeColor="text1"/>
+          <w:szCs w:val="24"/>
+          <w:lang w:val="es-ES_tradnl" w:eastAsia="es-ES_tradnl"/>
+        </w:rPr>
+        <w:t xml:space="preserve"> %}</w:t>
+      </w:r>
+    </w:p>
+    <w:p>
+      <w:pPr>
+        <w:spacing w:before="100" w:beforeAutospacing="1" w:after="100" w:afterAutospacing="1" w:line="240" w:lineRule="auto"/>
+        <w:jc w:val="both"/>
+        <w:rPr>
+          <w:rFonts w:cs="Arial"/>
+          <w:color w:val="000000" w:themeColor="text1"/>
+          <w:szCs w:val="24"/>
+          <w:u w:val="single"/>
+          <w:lang w:val="es-ES_tradnl" w:eastAsia="es-ES_tradnl"/>
+        </w:rPr>
+      </w:pPr>
+      <w:r>
+        <w:rPr>
+          <w:rFonts w:cs="Arial"/>
+          <w:color w:val="000000" w:themeColor="text1"/>
+          <w:szCs w:val="24"/>
+          <w:u w:val="single"/>
+          <w:lang w:val="es-ES_tradnl" w:eastAsia="es-ES_tradnl"/>
+        </w:rPr>
+        <w:t xml:space="preserve">{%p </w:t>
+      </w:r>
+      <w:proofErr w:type="spellStart"/>
+      <w:r>
+        <w:rPr>
+          <w:rFonts w:cs="Arial"/>
+          <w:color w:val="000000" w:themeColor="text1"/>
+          <w:szCs w:val="24"/>
+          <w:u w:val="single"/>
+          <w:lang w:val="es-ES_tradnl" w:eastAsia="es-ES_tradnl"/>
+        </w:rPr>
+        <w:t>if</w:t>
+      </w:r>
+      <w:proofErr w:type="spellEnd"/>
+      <w:r>
+        <w:rPr>
+          <w:rFonts w:cs="Arial"/>
+          <w:color w:val="000000" w:themeColor="text1"/>
+          <w:szCs w:val="24"/>
+          <w:u w:val="single"/>
+          <w:lang w:val="es-ES_tradnl" w:eastAsia="es-ES_tradnl"/>
+        </w:rPr>
+        <w:t xml:space="preserve"> </w:t>
+      </w:r>
+      <w:proofErr w:type="spellStart"/>
+      <w:r>
+        <w:rPr>
+          <w:rFonts w:cs="Arial"/>
+          <w:color w:val="000000" w:themeColor="text1"/>
+          <w:szCs w:val="24"/>
+          <w:u w:val="single"/>
+          <w:lang w:val="es-ES_tradnl" w:eastAsia="es-ES_tradnl"/>
+        </w:rPr>
+        <w:t>tipo_estudio</w:t>
+      </w:r>
+      <w:proofErr w:type="spellEnd"/>
+      <w:r>
+        <w:rPr>
+          <w:rFonts w:cs="Arial"/>
+          <w:color w:val="000000" w:themeColor="text1"/>
+          <w:szCs w:val="24"/>
+          <w:u w:val="single"/>
+          <w:lang w:val="es-ES_tradnl" w:eastAsia="es-ES_tradnl"/>
+        </w:rPr>
+        <w:t xml:space="preserve"> == “unidades”</w:t>
+      </w:r>
+      <w:r>
+        <w:rPr>
+          <w:rFonts w:cs="Arial"/>
+          <w:color w:val="000000" w:themeColor="text1"/>
+          <w:szCs w:val="24"/>
+          <w:u w:val="single"/>
+          <w:lang w:val="es-ES_tradnl" w:eastAsia="es-ES_tradnl"/>
+        </w:rPr>
+        <w:t xml:space="preserve"> </w:t>
+      </w:r>
+      <w:r>
+        <w:rPr>
+          <w:rFonts w:cs="Arial"/>
+          <w:color w:val="000000" w:themeColor="text1"/>
+          <w:szCs w:val="24"/>
+          <w:u w:val="single"/>
+          <w:lang w:val="es-ES_tradnl" w:eastAsia="es-ES_tradnl"/>
+        </w:rPr>
+        <w:t>%}</w:t>
+      </w:r>
+    </w:p>
+    <w:p>
+      <w:pPr>
+        <w:pStyle w:val="Prrafodelista"/>
+        <w:spacing w:before="100" w:beforeAutospacing="1" w:after="100" w:afterAutospacing="1" w:line="240" w:lineRule="auto"/>
+        <w:jc w:val="center"/>
+        <w:rPr>
+          <w:rFonts w:cs="Arial"/>
+          <w:b/>
+          <w:bCs/>
+          <w:color w:val="000000" w:themeColor="text1"/>
+          <w:szCs w:val="24"/>
+          <w:lang w:val="es-ES_tradnl" w:eastAsia="es-ES_tradnl"/>
+        </w:rPr>
+      </w:pPr>
+      <w:r>
+        <w:rPr>
+          <w:rFonts w:cs="Arial"/>
+          <w:b/>
+          <w:bCs/>
+          <w:color w:val="000000" w:themeColor="text1"/>
+          <w:szCs w:val="24"/>
+          <w:lang w:val="es-ES_tradnl" w:eastAsia="es-ES_tradnl"/>
+        </w:rPr>
+        <w:t>(</w:t>
+      </w:r>
+      <w:r>
+        <w:rPr>
+          <w:rFonts w:cs="Arial"/>
+          <w:b/>
+          <w:bCs/>
+          <w:szCs w:val="24"/>
+        </w:rPr>
+        <w:t xml:space="preserve">UF </w:t>
+      </w:r>
+      <w:r>
+        <w:rPr>
+          <w:rFonts w:cs="Arial"/>
+          <w:b/>
+          <w:szCs w:val="24"/>
+        </w:rPr>
+        <w:t xml:space="preserve">{{ </w:t>
+      </w:r>
+      <w:proofErr w:type="spellStart"/>
+      <w:r>
+        <w:rPr>
+          <w:rFonts w:cs="Arial"/>
+          <w:b/>
+          <w:szCs w:val="24"/>
+        </w:rPr>
+        <w:t>valor_reconstruccion_depreciacion</w:t>
+      </w:r>
+      <w:proofErr w:type="spellEnd"/>
+      <w:r>
+        <w:rPr>
+          <w:rFonts w:cs="Arial"/>
+          <w:b/>
+          <w:szCs w:val="24"/>
+        </w:rPr>
+        <w:t xml:space="preserve"> }}</w:t>
+      </w:r>
+      <w:r>
+        <w:rPr>
+          <w:rFonts w:cs="Arial"/>
+          <w:b/>
+          <w:bCs/>
+          <w:color w:val="000000" w:themeColor="text1"/>
+          <w:szCs w:val="24"/>
+          <w:lang w:val="es-ES_tradnl" w:eastAsia="es-ES_tradnl"/>
+        </w:rPr>
+        <w:t xml:space="preserve"> x </w:t>
+      </w:r>
+      <w:r>
+        <w:rPr>
+          <w:rFonts w:cs="Arial"/>
+          <w:b/>
+          <w:szCs w:val="24"/>
+        </w:rPr>
+        <w:t>50</w:t>
+      </w:r>
+      <w:r>
+        <w:rPr>
+          <w:rFonts w:cs="Arial"/>
+          <w:b/>
+          <w:bCs/>
+          <w:szCs w:val="24"/>
+        </w:rPr>
+        <w:t>%</w:t>
+      </w:r>
+      <w:r>
+        <w:rPr>
+          <w:rFonts w:cs="Arial"/>
+          <w:b/>
+          <w:bCs/>
+          <w:color w:val="000000" w:themeColor="text1"/>
+          <w:szCs w:val="24"/>
+          <w:lang w:val="es-ES_tradnl" w:eastAsia="es-ES_tradnl"/>
+        </w:rPr>
+        <w:t xml:space="preserve">) = </w:t>
+      </w:r>
+      <w:r>
+        <w:rPr>
+          <w:rFonts w:cs="Arial"/>
+          <w:b/>
+          <w:bCs/>
+          <w:szCs w:val="24"/>
+        </w:rPr>
+        <w:t xml:space="preserve">UF </w:t>
+      </w:r>
+      <w:r>
+        <w:rPr>
+          <w:rFonts w:cs="Arial"/>
+          <w:b/>
+          <w:bCs/>
+          <w:szCs w:val="24"/>
+        </w:rPr>
+        <w:t xml:space="preserve">{{ </w:t>
+      </w:r>
+      <w:proofErr w:type="spellStart"/>
+      <w:r>
+        <w:rPr>
+          <w:rFonts w:cs="Arial"/>
+          <w:b/>
+          <w:bCs/>
+          <w:szCs w:val="24"/>
+        </w:rPr>
+        <w:t>monto_asegurado_sugerido</w:t>
+      </w:r>
+      <w:proofErr w:type="spellEnd"/>
+      <w:r>
+        <w:rPr>
+          <w:rFonts w:cs="Arial"/>
+          <w:b/>
+          <w:bCs/>
+          <w:szCs w:val="24"/>
+        </w:rPr>
+        <w:t xml:space="preserve"> }}</w:t>
+      </w:r>
+      <w:r>
+        <w:rPr>
+          <w:rFonts w:cs="Arial"/>
+          <w:b/>
+          <w:bCs/>
+          <w:color w:val="000000" w:themeColor="text1"/>
+          <w:szCs w:val="24"/>
+          <w:lang w:val="es-ES_tradnl" w:eastAsia="es-ES_tradnl"/>
+        </w:rPr>
+        <w:t xml:space="preserve"> aprox.</w:t>
+      </w:r>
+      <w:r>
+        <w:rPr>
+          <w:rFonts w:cs="Arial"/>
+          <w:b/>
+          <w:bCs/>
+          <w:color w:val="000000" w:themeColor="text1"/>
+          <w:szCs w:val="24"/>
+          <w:lang w:val="es-ES_tradnl" w:eastAsia="es-ES_tradnl"/>
+        </w:rPr>
+        <w:br/>
+      </w:r>
+      <w:r>
+        <w:rPr>
+          <w:rFonts w:cs="Arial"/>
+          <w:bCs/>
+          <w:color w:val="000000" w:themeColor="text1"/>
+          <w:szCs w:val="24"/>
+          <w:lang w:val="es-ES_tradnl" w:eastAsia="es-ES_tradnl"/>
+        </w:rPr>
+        <w:t xml:space="preserve">(Valor total de Reconstrucción x </w:t>
+      </w:r>
+      <w:r>
+        <w:rPr>
+          <w:rFonts w:cs="Arial"/>
+          <w:szCs w:val="24"/>
+        </w:rPr>
+        <w:t>50</w:t>
+      </w:r>
+      <w:r>
+        <w:rPr>
+          <w:rFonts w:cs="Arial"/>
+          <w:szCs w:val="24"/>
+        </w:rPr>
+        <w:t>%</w:t>
+      </w:r>
+      <w:r>
+        <w:rPr>
+          <w:rFonts w:cs="Arial"/>
+          <w:bCs/>
+          <w:color w:val="000000" w:themeColor="text1"/>
+          <w:szCs w:val="24"/>
+          <w:lang w:val="es-ES_tradnl" w:eastAsia="es-ES_tradnl"/>
+        </w:rPr>
+        <w:t xml:space="preserve"> Espacio </w:t>
+      </w:r>
+      <w:r>
+        <w:rPr>
+          <w:rFonts w:cs="Arial"/>
+          <w:bCs/>
+          <w:color w:val="000000" w:themeColor="text1"/>
+          <w:szCs w:val="24"/>
+          <w:lang w:val="es-ES_tradnl" w:eastAsia="es-ES_tradnl"/>
+        </w:rPr>
+        <w:t>Unidades</w:t>
+      </w:r>
+      <w:r>
+        <w:rPr>
+          <w:rFonts w:cs="Arial"/>
+          <w:bCs/>
+          <w:color w:val="000000" w:themeColor="text1"/>
+          <w:szCs w:val="24"/>
+          <w:lang w:val="es-ES_tradnl" w:eastAsia="es-ES_tradnl"/>
+        </w:rPr>
+        <w:t>) = Valor de Reconstrucción de</w:t>
+      </w:r>
+      <w:r>
+        <w:rPr>
+          <w:rFonts w:cs="Arial"/>
+          <w:bCs/>
+          <w:color w:val="000000" w:themeColor="text1"/>
+          <w:szCs w:val="24"/>
+          <w:lang w:val="es-ES_tradnl" w:eastAsia="es-ES_tradnl"/>
+        </w:rPr>
+        <w:t xml:space="preserve"> las Unidades</w:t>
+      </w:r>
+      <w:r>
+        <w:rPr>
+          <w:rFonts w:cs="Arial"/>
+          <w:bCs/>
+          <w:color w:val="000000" w:themeColor="text1"/>
+          <w:szCs w:val="24"/>
+          <w:lang w:val="es-ES_tradnl" w:eastAsia="es-ES_tradnl"/>
+        </w:rPr>
+        <w:t>.</w:t>
+      </w:r>
+    </w:p>
+    <w:p>
+      <w:pPr>
+        <w:spacing w:before="100" w:beforeAutospacing="1" w:after="100" w:afterAutospacing="1" w:line="240" w:lineRule="auto"/>
+        <w:jc w:val="both"/>
+        <w:rPr>
+          <w:rFonts w:cs="Arial"/>
+          <w:color w:val="000000" w:themeColor="text1"/>
+          <w:szCs w:val="24"/>
+          <w:lang w:val="es-ES_tradnl" w:eastAsia="es-ES_tradnl"/>
+        </w:rPr>
+      </w:pPr>
+      <w:r>
+        <w:rPr>
+          <w:rFonts w:cs="Arial"/>
+          <w:color w:val="000000" w:themeColor="text1"/>
+          <w:szCs w:val="24"/>
+          <w:lang w:val="es-ES_tradnl" w:eastAsia="es-ES_tradnl"/>
+        </w:rPr>
+        <w:t xml:space="preserve">{%p </w:t>
+      </w:r>
+      <w:proofErr w:type="spellStart"/>
+      <w:r>
+        <w:rPr>
+          <w:rFonts w:cs="Arial"/>
+          <w:color w:val="000000" w:themeColor="text1"/>
+          <w:szCs w:val="24"/>
+          <w:lang w:val="es-ES_tradnl" w:eastAsia="es-ES_tradnl"/>
+        </w:rPr>
+        <w:t>endif</w:t>
+      </w:r>
+      <w:proofErr w:type="spellEnd"/>
+      <w:r>
+        <w:rPr>
+          <w:rFonts w:cs="Arial"/>
+          <w:color w:val="000000" w:themeColor="text1"/>
+          <w:szCs w:val="24"/>
+          <w:lang w:val="es-ES_tradnl" w:eastAsia="es-ES_tradnl"/>
+        </w:rPr>
+        <w:t xml:space="preserve"> %}</w:t>
+      </w:r>
+    </w:p>
+    <w:p>
+      <w:pPr>
+        <w:spacing w:before="100" w:beforeAutospacing="1" w:after="100" w:afterAutospacing="1" w:line="240" w:lineRule="auto"/>
+        <w:jc w:val="both"/>
+        <w:rPr>
+          <w:rFonts w:cs="Arial"/>
+          <w:color w:val="000000" w:themeColor="text1"/>
+          <w:szCs w:val="24"/>
+          <w:lang w:val="es-ES_tradnl" w:eastAsia="es-ES_tradnl"/>
+        </w:rPr>
+      </w:pPr>
+      <w:r>
+        <w:rPr>
+          <w:rFonts w:cs="Arial"/>
+          <w:b/>
+          <w:bCs/>
+          <w:color w:val="000000" w:themeColor="text1"/>
+          <w:szCs w:val="24"/>
+          <w:u w:val="single"/>
+          <w:lang w:val="es-ES_tradnl" w:eastAsia="es-ES_tradnl"/>
+        </w:rPr>
+        <w:t>NOTA</w:t>
+      </w:r>
+      <w:r>
+        <w:rPr>
+          <w:rFonts w:cs="Arial"/>
+          <w:color w:val="000000" w:themeColor="text1"/>
+          <w:szCs w:val="24"/>
+          <w:lang w:val="es-ES_tradnl" w:eastAsia="es-ES_tradnl"/>
+        </w:rPr>
+        <w:t>: Es importante destacar que los montos asegurables a entregar a la compañía aseguradora, deben ser proporcionados por el asegurado y serán de su responsabilidad ante cualquiera situación que pueda involucrar un infraseguro o sobre seguro. Todos los montos presentados en este estudio de forma técnica por nuestra corredora, representan solo una visión a considerar por el asegurado, pero no serán una imposición al respecto de estos temas para él, de nuestra parte.</w:t>
+      </w:r>
+    </w:p>
+    <w:p>
+      <w:pPr>
+        <w:spacing w:before="100" w:beforeAutospacing="1" w:after="100" w:afterAutospacing="1" w:line="240" w:lineRule="auto"/>
+        <w:jc w:val="both"/>
+        <w:rPr>
+          <w:rFonts w:cs="Arial"/>
+          <w:color w:val="000000" w:themeColor="text1"/>
+          <w:szCs w:val="24"/>
+          <w:lang w:val="es-ES_tradnl" w:eastAsia="es-ES_tradnl"/>
+        </w:rPr>
+      </w:pPr>
+      <w:r>
+        <w:rPr>
+          <w:rFonts w:cs="Arial"/>
+          <w:b/>
+          <w:color w:val="000000" w:themeColor="text1"/>
+          <w:szCs w:val="24"/>
+          <w:u w:val="single"/>
+          <w:lang w:val="es-ES_tradnl" w:eastAsia="es-ES_tradnl"/>
+        </w:rPr>
+        <w:br/>
+        <w:t>IMPORTANTE</w:t>
+      </w:r>
+      <w:r>
+        <w:rPr>
+          <w:rFonts w:cs="Arial"/>
+          <w:b/>
+          <w:color w:val="000000" w:themeColor="text1"/>
+          <w:szCs w:val="24"/>
+          <w:lang w:val="es-ES_tradnl" w:eastAsia="es-ES_tradnl"/>
+        </w:rPr>
+        <w:t>:</w:t>
+      </w:r>
+      <w:r>
+        <w:rPr>
+          <w:rFonts w:cs="Arial"/>
+          <w:color w:val="000000" w:themeColor="text1"/>
+          <w:szCs w:val="24"/>
+          <w:lang w:val="es-ES_tradnl" w:eastAsia="es-ES_tradnl"/>
+        </w:rPr>
+        <w:t xml:space="preserve"> Destacar que en un </w:t>
+      </w:r>
+      <w:r>
+        <w:rPr>
+          <w:rFonts w:cs="Arial"/>
+          <w:b/>
+          <w:color w:val="000000" w:themeColor="text1"/>
+          <w:szCs w:val="24"/>
+          <w:lang w:val="es-ES_tradnl" w:eastAsia="es-ES_tradnl"/>
+        </w:rPr>
+        <w:t>Edificio de Comunidad Habitacional</w:t>
+      </w:r>
+      <w:r>
+        <w:rPr>
+          <w:rFonts w:cs="Arial"/>
+          <w:color w:val="000000" w:themeColor="text1"/>
+          <w:szCs w:val="24"/>
+          <w:lang w:val="es-ES_tradnl" w:eastAsia="es-ES_tradnl"/>
+        </w:rPr>
+        <w:t xml:space="preserve"> se debe </w:t>
+      </w:r>
+      <w:r>
+        <w:rPr>
+          <w:rFonts w:cs="Arial"/>
+          <w:b/>
+          <w:color w:val="000000" w:themeColor="text1"/>
+          <w:szCs w:val="24"/>
+          <w:lang w:val="es-ES_tradnl" w:eastAsia="es-ES_tradnl"/>
+        </w:rPr>
+        <w:t>Asegurar</w:t>
+      </w:r>
+      <w:r>
+        <w:rPr>
+          <w:rFonts w:cs="Arial"/>
+          <w:color w:val="000000" w:themeColor="text1"/>
+          <w:szCs w:val="24"/>
+          <w:lang w:val="es-ES_tradnl" w:eastAsia="es-ES_tradnl"/>
+        </w:rPr>
+        <w:t xml:space="preserve"> en relaci</w:t>
+      </w:r>
+      <w:r>
+        <w:rPr>
+          <w:rFonts w:eastAsia="Helvetica" w:cs="Arial"/>
+          <w:color w:val="000000" w:themeColor="text1"/>
+          <w:szCs w:val="24"/>
+          <w:lang w:val="es-ES_tradnl" w:eastAsia="es-ES_tradnl"/>
+        </w:rPr>
+        <w:t xml:space="preserve">ón a Espacios Comunes, </w:t>
+      </w:r>
+      <w:r>
+        <w:rPr>
+          <w:rFonts w:cs="Arial"/>
+          <w:b/>
+          <w:color w:val="000000" w:themeColor="text1"/>
+          <w:szCs w:val="24"/>
+          <w:lang w:val="es-ES_tradnl" w:eastAsia="es-ES_tradnl"/>
+        </w:rPr>
+        <w:t>según valor de reconstrucción</w:t>
+      </w:r>
+      <w:r>
+        <w:rPr>
+          <w:rFonts w:cs="Arial"/>
+          <w:color w:val="000000" w:themeColor="text1"/>
+          <w:szCs w:val="24"/>
+          <w:lang w:val="es-ES_tradnl" w:eastAsia="es-ES_tradnl"/>
+        </w:rPr>
+        <w:t xml:space="preserve"> y </w:t>
+      </w:r>
+      <w:r>
+        <w:rPr>
+          <w:rFonts w:cs="Arial"/>
+          <w:b/>
+          <w:color w:val="000000" w:themeColor="text1"/>
+          <w:szCs w:val="24"/>
+          <w:lang w:val="es-ES_tradnl" w:eastAsia="es-ES_tradnl"/>
+        </w:rPr>
+        <w:t>no valor comercial</w:t>
+      </w:r>
+      <w:r>
+        <w:rPr>
+          <w:rFonts w:cs="Arial"/>
+          <w:color w:val="000000" w:themeColor="text1"/>
+          <w:szCs w:val="24"/>
+          <w:lang w:val="es-ES_tradnl" w:eastAsia="es-ES_tradnl"/>
+        </w:rPr>
+        <w:t xml:space="preserve">, pues las </w:t>
+      </w:r>
+      <w:r>
+        <w:rPr>
+          <w:rFonts w:cs="Arial"/>
+          <w:b/>
+          <w:color w:val="000000" w:themeColor="text1"/>
+          <w:szCs w:val="24"/>
+          <w:lang w:val="es-ES_tradnl" w:eastAsia="es-ES_tradnl"/>
+        </w:rPr>
+        <w:t>compañías de Seguros no pagan plusvalía</w:t>
+      </w:r>
+      <w:r>
+        <w:rPr>
+          <w:rFonts w:cs="Arial"/>
+          <w:color w:val="000000" w:themeColor="text1"/>
+          <w:szCs w:val="24"/>
+          <w:lang w:val="es-ES_tradnl" w:eastAsia="es-ES_tradnl"/>
+        </w:rPr>
+        <w:t>, se busca que el asegurado recupere el bien afectado en las mismas condiciones en las que estaba hasta antes de un Siniestro.</w:t>
       </w:r>
     </w:p>
     <w:p>
@@ -2643,198 +3347,6 @@
           <w:u w:val="single"/>
           <w:lang w:val="es-ES_tradnl" w:eastAsia="es-ES_tradnl"/>
         </w:rPr>
-        <w:t>NOTA</w:t>
-      </w:r>
-      <w:r>
-        <w:rPr>
-          <w:rFonts w:cs="Arial"/>
-          <w:color w:val="000000" w:themeColor="text1"/>
-          <w:szCs w:val="24"/>
-          <w:lang w:val="es-ES_tradnl" w:eastAsia="es-ES_tradnl"/>
-        </w:rPr>
-        <w:t>: Es importante destacar que los montos asegurables a entregar a la compañía aseguradora, deben ser proporcionados por el asegurado y serán de su responsabilidad ante cualquiera situación que pueda involucrar un infraseguro o sobre seguro. Todos los montos presentados en este estudio de forma técnica por nuestra corredora, representan solo una visión a considerar por el asegurado, pero no serán una imposición al respecto de estos temas para él, de nuestra parte.</w:t>
-      </w:r>
-    </w:p>
-    <w:p>
-      <w:pPr>
-        <w:spacing w:before="100" w:beforeAutospacing="1" w:after="100" w:afterAutospacing="1" w:line="240" w:lineRule="auto"/>
-        <w:jc w:val="both"/>
-        <w:rPr>
-          <w:rFonts w:cs="Arial"/>
-          <w:color w:val="000000" w:themeColor="text1"/>
-          <w:szCs w:val="24"/>
-          <w:lang w:val="es-ES_tradnl" w:eastAsia="es-ES_tradnl"/>
-        </w:rPr>
-      </w:pPr>
-      <w:r>
-        <w:rPr>
-          <w:rFonts w:cs="Arial"/>
-          <w:b/>
-          <w:color w:val="000000" w:themeColor="text1"/>
-          <w:szCs w:val="24"/>
-          <w:u w:val="single"/>
-          <w:lang w:val="es-ES_tradnl" w:eastAsia="es-ES_tradnl"/>
-        </w:rPr>
-        <w:br/>
-        <w:t>IMPORTANTE</w:t>
-      </w:r>
-      <w:r>
-        <w:rPr>
-          <w:rFonts w:cs="Arial"/>
-          <w:b/>
-          <w:color w:val="000000" w:themeColor="text1"/>
-          <w:szCs w:val="24"/>
-          <w:lang w:val="es-ES_tradnl" w:eastAsia="es-ES_tradnl"/>
-        </w:rPr>
-        <w:t>:</w:t>
-      </w:r>
-      <w:r>
-        <w:rPr>
-          <w:rFonts w:cs="Arial"/>
-          <w:color w:val="000000" w:themeColor="text1"/>
-          <w:szCs w:val="24"/>
-          <w:lang w:val="es-ES_tradnl" w:eastAsia="es-ES_tradnl"/>
-        </w:rPr>
-        <w:t xml:space="preserve"> Destacar que en un </w:t>
-      </w:r>
-      <w:r>
-        <w:rPr>
-          <w:rFonts w:cs="Arial"/>
-          <w:b/>
-          <w:color w:val="000000" w:themeColor="text1"/>
-          <w:szCs w:val="24"/>
-          <w:lang w:val="es-ES_tradnl" w:eastAsia="es-ES_tradnl"/>
-        </w:rPr>
-        <w:t>Edificio de Comunidad Habitacional</w:t>
-      </w:r>
-      <w:r>
-        <w:rPr>
-          <w:rFonts w:cs="Arial"/>
-          <w:color w:val="000000" w:themeColor="text1"/>
-          <w:szCs w:val="24"/>
-          <w:lang w:val="es-ES_tradnl" w:eastAsia="es-ES_tradnl"/>
-        </w:rPr>
-        <w:t xml:space="preserve"> se debe </w:t>
-      </w:r>
-      <w:r>
-        <w:rPr>
-          <w:rFonts w:cs="Arial"/>
-          <w:b/>
-          <w:color w:val="000000" w:themeColor="text1"/>
-          <w:szCs w:val="24"/>
-          <w:lang w:val="es-ES_tradnl" w:eastAsia="es-ES_tradnl"/>
-        </w:rPr>
-        <w:t>Asegurar</w:t>
-      </w:r>
-      <w:r>
-        <w:rPr>
-          <w:rFonts w:cs="Arial"/>
-          <w:color w:val="000000" w:themeColor="text1"/>
-          <w:szCs w:val="24"/>
-          <w:lang w:val="es-ES_tradnl" w:eastAsia="es-ES_tradnl"/>
-        </w:rPr>
-        <w:t xml:space="preserve"> en relaci</w:t>
-      </w:r>
-      <w:r>
-        <w:rPr>
-          <w:rFonts w:eastAsia="Helvetica" w:cs="Arial"/>
-          <w:color w:val="000000" w:themeColor="text1"/>
-          <w:szCs w:val="24"/>
-          <w:lang w:val="es-ES_tradnl" w:eastAsia="es-ES_tradnl"/>
-        </w:rPr>
-        <w:t xml:space="preserve">ón a Espacios Comunes, </w:t>
-      </w:r>
-      <w:r>
-        <w:rPr>
-          <w:rFonts w:cs="Arial"/>
-          <w:b/>
-          <w:color w:val="000000" w:themeColor="text1"/>
-          <w:szCs w:val="24"/>
-          <w:lang w:val="es-ES_tradnl" w:eastAsia="es-ES_tradnl"/>
-        </w:rPr>
-        <w:t>según valor de reconstrucción</w:t>
-      </w:r>
-      <w:r>
-        <w:rPr>
-          <w:rFonts w:cs="Arial"/>
-          <w:color w:val="000000" w:themeColor="text1"/>
-          <w:szCs w:val="24"/>
-          <w:lang w:val="es-ES_tradnl" w:eastAsia="es-ES_tradnl"/>
-        </w:rPr>
-        <w:t xml:space="preserve"> y </w:t>
-      </w:r>
-      <w:r>
-        <w:rPr>
-          <w:rFonts w:cs="Arial"/>
-          <w:b/>
-          <w:color w:val="000000" w:themeColor="text1"/>
-          <w:szCs w:val="24"/>
-          <w:lang w:val="es-ES_tradnl" w:eastAsia="es-ES_tradnl"/>
-        </w:rPr>
-        <w:t>no valor comercial</w:t>
-      </w:r>
-      <w:r>
-        <w:rPr>
-          <w:rFonts w:cs="Arial"/>
-          <w:color w:val="000000" w:themeColor="text1"/>
-          <w:szCs w:val="24"/>
-          <w:lang w:val="es-ES_tradnl" w:eastAsia="es-ES_tradnl"/>
-        </w:rPr>
-        <w:t xml:space="preserve">, pues las </w:t>
-      </w:r>
-      <w:r>
-        <w:rPr>
-          <w:rFonts w:cs="Arial"/>
-          <w:b/>
-          <w:color w:val="000000" w:themeColor="text1"/>
-          <w:szCs w:val="24"/>
-          <w:lang w:val="es-ES_tradnl" w:eastAsia="es-ES_tradnl"/>
-        </w:rPr>
-        <w:t>compañías de Seguros no pagan plusvalía</w:t>
-      </w:r>
-      <w:r>
-        <w:rPr>
-          <w:rFonts w:cs="Arial"/>
-          <w:color w:val="000000" w:themeColor="text1"/>
-          <w:szCs w:val="24"/>
-          <w:lang w:val="es-ES_tradnl" w:eastAsia="es-ES_tradnl"/>
-        </w:rPr>
-        <w:t>, se busca que el asegurado recupere el bien afectado en las mismas condiciones en las que estaba hasta antes de un Siniestro.</w:t>
-      </w:r>
-    </w:p>
-    <w:p>
-      <w:pPr>
-        <w:spacing w:before="100" w:beforeAutospacing="1" w:after="100" w:afterAutospacing="1" w:line="240" w:lineRule="auto"/>
-        <w:jc w:val="both"/>
-        <w:rPr>
-          <w:rFonts w:cs="Arial"/>
-          <w:color w:val="000000" w:themeColor="text1"/>
-          <w:szCs w:val="24"/>
-          <w:lang w:val="es-ES_tradnl" w:eastAsia="es-ES_tradnl"/>
-        </w:rPr>
-      </w:pPr>
-    </w:p>
-    <w:p>
-      <w:pPr>
-        <w:spacing w:before="100" w:beforeAutospacing="1" w:after="100" w:afterAutospacing="1" w:line="240" w:lineRule="auto"/>
-        <w:jc w:val="both"/>
-        <w:rPr>
-          <w:rFonts w:cs="Arial"/>
-          <w:color w:val="000000" w:themeColor="text1"/>
-          <w:szCs w:val="24"/>
-          <w:lang w:val="es-ES_tradnl" w:eastAsia="es-ES_tradnl"/>
-        </w:rPr>
-      </w:pPr>
-      <w:r>
-        <w:rPr>
-          <w:rFonts w:cs="Arial"/>
-          <w:b/>
-          <w:bCs/>
-          <w:color w:val="000000" w:themeColor="text1"/>
-          <w:szCs w:val="24"/>
-          <w:u w:val="single"/>
-          <w:lang w:val="es-ES_tradnl" w:eastAsia="es-ES_tradnl"/>
-        </w:rPr>
         <w:t>3</w:t>
       </w:r>
       <w:r>
@@ -3332,6 +3844,7 @@
           <w:u w:val="single"/>
           <w:lang w:val="es-ES_tradnl" w:eastAsia="es-ES_tradnl"/>
         </w:rPr>
+        <w:lastRenderedPageBreak/>
         <w:t>4</w:t>
       </w:r>
       <w:r>
@@ -3739,7 +4252,6 @@
           <w:u w:val="single"/>
           <w:lang w:val="es-ES_tradnl" w:eastAsia="es-ES_tradnl"/>
         </w:rPr>
-        <w:lastRenderedPageBreak/>
         <w:t xml:space="preserve">Monto (Actual) </w:t>
       </w:r>
       <w:r>
@@ -5792,6 +6304,7 @@
                 <w:szCs w:val="20"/>
                 <w:lang w:val="es-ES_tradnl" w:eastAsia="es-ES_tradnl"/>
               </w:rPr>
+              <w:lastRenderedPageBreak/>
               <w:t>none</w:t>
             </w:r>
             <w:proofErr w:type="spellEnd"/>
@@ -5907,6 +6420,7 @@
                 <w:szCs w:val="20"/>
                 <w:lang w:val="es-ES_tradnl" w:eastAsia="es-ES_tradnl"/>
               </w:rPr>
+              <w:lastRenderedPageBreak/>
               <w:t xml:space="preserve">{% </w:t>
             </w:r>
             <w:proofErr w:type="spellStart"/>
@@ -6006,6 +6520,7 @@
                 <w:szCs w:val="20"/>
                 <w:lang w:val="es-ES_tradnl" w:eastAsia="es-ES_tradnl"/>
               </w:rPr>
+              <w:lastRenderedPageBreak/>
               <w:t>none</w:t>
             </w:r>
             <w:proofErr w:type="spellEnd"/>
@@ -6129,6 +6644,7 @@
                 <w:szCs w:val="20"/>
                 <w:lang w:val="es-ES_tradnl" w:eastAsia="es-ES_tradnl"/>
               </w:rPr>
+              <w:lastRenderedPageBreak/>
               <w:t>{%</w:t>
             </w:r>
             <w:proofErr w:type="spellStart"/>
@@ -6396,7 +6912,6 @@
           <w:szCs w:val="24"/>
           <w:lang w:val="es-ES_tradnl" w:eastAsia="es-ES_tradnl"/>
         </w:rPr>
-        <w:lastRenderedPageBreak/>
         <w:t xml:space="preserve">{{ </w:t>
       </w:r>
       <w:proofErr w:type="spellStart"/>
@@ -8073,6 +8588,7 @@
                 <w:szCs w:val="20"/>
                 <w:lang w:val="es-ES_tradnl" w:eastAsia="es-ES_tradnl"/>
               </w:rPr>
+              <w:lastRenderedPageBreak/>
               <w:t>{%</w:t>
             </w:r>
             <w:proofErr w:type="spellStart"/>
@@ -9010,7 +9526,6 @@
                 <w:szCs w:val="20"/>
                 <w:lang w:val="es-ES_tradnl" w:eastAsia="es-ES_tradnl"/>
               </w:rPr>
-              <w:lastRenderedPageBreak/>
               <w:t>{%</w:t>
             </w:r>
             <w:proofErr w:type="spellStart"/>
@@ -10555,6 +11070,7 @@
                 <w:sz w:val="22"/>
                 <w:lang w:val="es-ES_tradnl" w:eastAsia="es-ES_tradnl"/>
               </w:rPr>
+              <w:lastRenderedPageBreak/>
               <w:t>Compañía</w:t>
             </w:r>
           </w:p>
@@ -11400,7 +11916,6 @@
                 <w:szCs w:val="20"/>
                 <w:lang w:val="es-ES_tradnl" w:eastAsia="es-ES_tradnl"/>
               </w:rPr>
-              <w:lastRenderedPageBreak/>
               <w:t>not</w:t>
             </w:r>
             <w:proofErr w:type="spellEnd"/>
@@ -11538,7 +12053,6 @@
                 <w:szCs w:val="20"/>
                 <w:lang w:val="es-ES_tradnl" w:eastAsia="es-ES_tradnl"/>
               </w:rPr>
-              <w:lastRenderedPageBreak/>
               <w:t xml:space="preserve">{% </w:t>
             </w:r>
             <w:proofErr w:type="spellStart"/>
@@ -11616,7 +12130,6 @@
                 <w:szCs w:val="20"/>
                 <w:lang w:val="es-ES_tradnl" w:eastAsia="es-ES_tradnl"/>
               </w:rPr>
-              <w:lastRenderedPageBreak/>
               <w:t>not</w:t>
             </w:r>
             <w:proofErr w:type="spellEnd"/>
@@ -11752,7 +12265,6 @@
                 <w:szCs w:val="20"/>
                 <w:lang w:val="es-ES_tradnl" w:eastAsia="es-ES_tradnl"/>
               </w:rPr>
-              <w:lastRenderedPageBreak/>
               <w:t>{%</w:t>
             </w:r>
             <w:proofErr w:type="spellStart"/>
@@ -13062,6 +13574,7 @@
           <w:u w:val="single"/>
           <w:lang w:val="es-ES_tradnl" w:eastAsia="es-ES_tradnl"/>
         </w:rPr>
+        <w:lastRenderedPageBreak/>
         <w:t xml:space="preserve">4.3.1.- </w:t>
       </w:r>
       <w:r>
@@ -13565,7 +14078,6 @@
                 <w:szCs w:val="20"/>
                 <w:lang w:val="es-ES_tradnl" w:eastAsia="es-ES_tradnl"/>
               </w:rPr>
-              <w:lastRenderedPageBreak/>
               <w:t>{%</w:t>
             </w:r>
             <w:proofErr w:type="spellStart"/>
@@ -15449,6 +15961,7 @@
                 <w:bCs/>
                 <w:szCs w:val="24"/>
               </w:rPr>
+              <w:lastRenderedPageBreak/>
               <w:t>detalle.valor_cuota_uf</w:t>
             </w:r>
             <w:proofErr w:type="spellEnd"/>
@@ -15634,6 +16147,7 @@
           <w:u w:val="single"/>
           <w:lang w:val="es-ES_tradnl" w:eastAsia="es-ES_tradnl"/>
         </w:rPr>
+        <w:lastRenderedPageBreak/>
         <w:t xml:space="preserve">{% </w:t>
       </w:r>
       <w:proofErr w:type="spellStart"/>
@@ -15734,7 +16248,6 @@
           <w:szCs w:val="24"/>
           <w:u w:val="single"/>
         </w:rPr>
-        <w:lastRenderedPageBreak/>
         <w:t xml:space="preserve"> }}</w:t>
       </w:r>
       <w:r>
@@ -17484,7 +17997,18 @@
           <w:szCs w:val="24"/>
           <w:lang w:val="es-ES_tradnl" w:eastAsia="es-ES_tradnl"/>
         </w:rPr>
-        <w:t>unidades, especialmente cuando éstas formen parte de una edificación continua, pareada o colectiva. Lo anterior es sin perjuicio de otras coberturas complementarias que la asamblea de copropietarios decida incluir en la respectiva póliza para la protección de los bienes comunes y/o sus unidades, tales como sismo o salida de mar</w:t>
+        <w:t xml:space="preserve">unidades, especialmente cuando éstas formen parte de una edificación continua, pareada o colectiva. Lo anterior es sin perjuicio de otras coberturas complementarias que la asamblea de </w:t>
+      </w:r>
+      <w:r>
+        <w:rPr>
+          <w:rFonts w:cs="Arial"/>
+          <w:bCs/>
+          <w:color w:val="000000" w:themeColor="text1"/>
+          <w:szCs w:val="24"/>
+          <w:lang w:val="es-ES_tradnl" w:eastAsia="es-ES_tradnl"/>
+        </w:rPr>
+        <w:lastRenderedPageBreak/>
+        <w:t>copropietarios decida incluir en la respectiva póliza para la protección de los bienes comunes y/o sus unidades, tales como sismo o salida de mar</w:t>
       </w:r>
       <w:r>
         <w:rPr>
@@ -17582,17 +18106,7 @@
           <w:szCs w:val="24"/>
           <w:lang w:val="es-ES_tradnl" w:eastAsia="es-ES_tradnl"/>
         </w:rPr>
-        <w:t xml:space="preserve">pues debido a </w:t>
-      </w:r>
-      <w:r>
-        <w:rPr>
-          <w:rFonts w:cs="Arial"/>
-          <w:color w:val="000000" w:themeColor="text1"/>
-          <w:szCs w:val="24"/>
-          <w:lang w:val="es-ES_tradnl" w:eastAsia="es-ES_tradnl"/>
-        </w:rPr>
-        <w:lastRenderedPageBreak/>
-        <w:t>vivir en un país de características sísmicas, estamos siempre expuestos a eventos perjudiciales.</w:t>
+        <w:t>pues debido a vivir en un país de características sísmicas, estamos siempre expuestos a eventos perjudiciales.</w:t>
       </w:r>
     </w:p>
     <w:p>

</xml_diff>